<commit_message>
docs: include Stitch Modern Editorial high-res UI screenshots in DOCX, HTML, and Markdown proposals
</commit_message>
<xml_diff>
--- a/docs/Daily_Amar_Desh_Mobile_App_Proposal_CybrCraft.docx
+++ b/docs/Daily_Amar_Desh_Mobile_App_Proposal_CybrCraft.docx
@@ -1944,7 +1944,350 @@
           <w:color w:val="0F172A"/>
           <w:sz w:val="36"/>
         </w:rPr>
-        <w:t>4. Project Timeline &amp; Rapid Delivery Roadmap</w:t>
+        <w:t>4. UI/UX Design System Showcase &amp; Broadsheet Aesthetics</w:t>
+      </w:r>
+    </w:p>
+    <w:p>
+      <w:pPr>
+        <w:spacing w:after="200"/>
+      </w:pPr>
+      <w:r>
+        <w:t>To honor Daily Amar Desh's legacy and broadsheet stature, CybrCraft engineered the 'Modern Editorial' design system via the Stitch UI framework. The visual interface replaces generic startup rounded shapes with authentic newspaper parchment (#FBF9F5), deep printer's ink (#121212), Editorial Crimson (#BA131A), and 1px hairline rules (#E5E0D8). The figures below present the actual high-fidelity mobile application screens generated for Daily Amar Desh:</w:t>
+      </w:r>
+    </w:p>
+    <w:tbl>
+      <w:tblPr>
+        <w:tblW w:type="auto" w:w="0"/>
+        <w:jc w:val="center"/>
+        <w:tblLayout w:type="fixed"/>
+        <w:tblLook w:firstColumn="1" w:firstRow="1" w:lastColumn="0" w:lastRow="0" w:noHBand="0" w:noVBand="1" w:val="04A0"/>
+        <w:tblBorders>
+          <w:top w:val="single" w:sz="4" w:space="0" w:color="CBD5E1"/>
+          <w:bottom w:val="single" w:sz="4" w:space="0" w:color="CBD5E1"/>
+          <w:insideH w:val="single" w:sz="4" w:space="0" w:color="CBD5E1"/>
+          <w:insideV w:val="none"/>
+          <w:left w:val="none"/>
+          <w:right w:val="none"/>
+        </w:tblBorders>
+      </w:tblPr>
+      <w:tblGrid>
+        <w:gridCol w:w="4608"/>
+        <w:gridCol w:w="4608"/>
+      </w:tblGrid>
+      <w:tr>
+        <w:tc>
+          <w:tcPr>
+            <w:tcW w:type="dxa" w:w="4608"/>
+            <w:shd w:fill="F8FAFC"/>
+            <w:tcMar>
+              <w:top w:w="100" w:type="dxa"/>
+              <w:bottom w:w="100" w:type="dxa"/>
+              <w:left w:w="100" w:type="dxa"/>
+              <w:right w:w="100" w:type="dxa"/>
+            </w:tcMar>
+          </w:tcPr>
+          <w:p>
+            <w:pPr>
+              <w:jc w:val="center"/>
+            </w:pPr>
+            <w:r>
+              <w:drawing>
+                <wp:inline xmlns:a="http://schemas.openxmlformats.org/drawingml/2006/main" xmlns:pic="http://schemas.openxmlformats.org/drawingml/2006/picture">
+                  <wp:extent cx="2560320" cy="4587240"/>
+                  <wp:docPr id="5" name="Picture 5"/>
+                  <wp:cNvGraphicFramePr>
+                    <a:graphicFrameLocks noChangeAspect="1"/>
+                  </wp:cNvGraphicFramePr>
+                  <a:graphic>
+                    <a:graphicData uri="http://schemas.openxmlformats.org/drawingml/2006/picture">
+                      <pic:pic>
+                        <pic:nvPicPr>
+                          <pic:cNvPr id="0" name="stitch_home_feed.jpg"/>
+                          <pic:cNvPicPr/>
+                        </pic:nvPicPr>
+                        <pic:blipFill>
+                          <a:blip r:embed="rId13"/>
+                          <a:stretch>
+                            <a:fillRect/>
+                          </a:stretch>
+                        </pic:blipFill>
+                        <pic:spPr>
+                          <a:xfrm>
+                            <a:off x="0" y="0"/>
+                            <a:ext cx="2560320" cy="4587240"/>
+                          </a:xfrm>
+                          <a:prstGeom prst="rect"/>
+                        </pic:spPr>
+                      </pic:pic>
+                    </a:graphicData>
+                  </a:graphic>
+                </wp:inline>
+              </w:drawing>
+            </w:r>
+          </w:p>
+          <w:p>
+            <w:pPr>
+              <w:spacing w:before="80" w:after="40"/>
+              <w:jc w:val="center"/>
+            </w:pPr>
+            <w:r>
+              <w:rPr>
+                <w:b/>
+                <w:color w:val="0F172A"/>
+                <w:sz w:val="17"/>
+              </w:rPr>
+              <w:t>Figure 3: Broadsheet Home Feed</w:t>
+              <w:br/>
+            </w:r>
+            <w:r>
+              <w:rPr>
+                <w:color w:val="64748B"/>
+                <w:sz w:val="15"/>
+              </w:rPr>
+              <w:t>Live masthead, breaking news ticker, lead hero splash, and 14-vertical category carousel chips.</w:t>
+            </w:r>
+          </w:p>
+        </w:tc>
+        <w:tc>
+          <w:tcPr>
+            <w:tcW w:type="dxa" w:w="4608"/>
+            <w:shd w:fill="F8FAFC"/>
+            <w:tcMar>
+              <w:top w:w="100" w:type="dxa"/>
+              <w:bottom w:w="100" w:type="dxa"/>
+              <w:left w:w="100" w:type="dxa"/>
+              <w:right w:w="100" w:type="dxa"/>
+            </w:tcMar>
+          </w:tcPr>
+          <w:p>
+            <w:pPr>
+              <w:jc w:val="center"/>
+            </w:pPr>
+            <w:r>
+              <w:drawing>
+                <wp:inline xmlns:a="http://schemas.openxmlformats.org/drawingml/2006/main" xmlns:pic="http://schemas.openxmlformats.org/drawingml/2006/picture">
+                  <wp:extent cx="2560320" cy="4587240"/>
+                  <wp:docPr id="6" name="Picture 6"/>
+                  <wp:cNvGraphicFramePr>
+                    <a:graphicFrameLocks noChangeAspect="1"/>
+                  </wp:cNvGraphicFramePr>
+                  <a:graphic>
+                    <a:graphicData uri="http://schemas.openxmlformats.org/drawingml/2006/picture">
+                      <pic:pic>
+                        <pic:nvPicPr>
+                          <pic:cNvPr id="0" name="stitch_article_reader.jpg"/>
+                          <pic:cNvPicPr/>
+                        </pic:nvPicPr>
+                        <pic:blipFill>
+                          <a:blip r:embed="rId14"/>
+                          <a:stretch>
+                            <a:fillRect/>
+                          </a:stretch>
+                        </pic:blipFill>
+                        <pic:spPr>
+                          <a:xfrm>
+                            <a:off x="0" y="0"/>
+                            <a:ext cx="2560320" cy="4587240"/>
+                          </a:xfrm>
+                          <a:prstGeom prst="rect"/>
+                        </pic:spPr>
+                      </pic:pic>
+                    </a:graphicData>
+                  </a:graphic>
+                </wp:inline>
+              </w:drawing>
+            </w:r>
+          </w:p>
+          <w:p>
+            <w:pPr>
+              <w:spacing w:before="80" w:after="40"/>
+              <w:jc w:val="center"/>
+            </w:pPr>
+            <w:r>
+              <w:rPr>
+                <w:b/>
+                <w:color w:val="0F172A"/>
+                <w:sz w:val="17"/>
+              </w:rPr>
+              <w:t>Figure 4: Narrative Article Reader</w:t>
+              <w:br/>
+            </w:r>
+            <w:r>
+              <w:rPr>
+                <w:color w:val="64748B"/>
+                <w:sz w:val="15"/>
+              </w:rPr>
+              <w:t>Book-grade typography (Newsreader / Noto Serif), 3-point AI smart summary, and bracketed author bylines.</w:t>
+            </w:r>
+          </w:p>
+        </w:tc>
+      </w:tr>
+      <w:tr>
+        <w:tc>
+          <w:tcPr>
+            <w:tcW w:type="dxa" w:w="4608"/>
+            <w:shd w:fill="F8FAFC"/>
+            <w:tcMar>
+              <w:top w:w="100" w:type="dxa"/>
+              <w:bottom w:w="100" w:type="dxa"/>
+              <w:left w:w="100" w:type="dxa"/>
+              <w:right w:w="100" w:type="dxa"/>
+            </w:tcMar>
+          </w:tcPr>
+          <w:p>
+            <w:pPr>
+              <w:jc w:val="center"/>
+            </w:pPr>
+            <w:r>
+              <w:drawing>
+                <wp:inline xmlns:a="http://schemas.openxmlformats.org/drawingml/2006/main" xmlns:pic="http://schemas.openxmlformats.org/drawingml/2006/picture">
+                  <wp:extent cx="2560320" cy="4587240"/>
+                  <wp:docPr id="7" name="Picture 7"/>
+                  <wp:cNvGraphicFramePr>
+                    <a:graphicFrameLocks noChangeAspect="1"/>
+                  </wp:cNvGraphicFramePr>
+                  <a:graphic>
+                    <a:graphicData uri="http://schemas.openxmlformats.org/drawingml/2006/picture">
+                      <pic:pic>
+                        <pic:nvPicPr>
+                          <pic:cNvPr id="0" name="stitch_epaper_saved.jpg"/>
+                          <pic:cNvPicPr/>
+                        </pic:nvPicPr>
+                        <pic:blipFill>
+                          <a:blip r:embed="rId15"/>
+                          <a:stretch>
+                            <a:fillRect/>
+                          </a:stretch>
+                        </pic:blipFill>
+                        <pic:spPr>
+                          <a:xfrm>
+                            <a:off x="0" y="0"/>
+                            <a:ext cx="2560320" cy="4587240"/>
+                          </a:xfrm>
+                          <a:prstGeom prst="rect"/>
+                        </pic:spPr>
+                      </pic:pic>
+                    </a:graphicData>
+                  </a:graphic>
+                </wp:inline>
+              </w:drawing>
+            </w:r>
+          </w:p>
+          <w:p>
+            <w:pPr>
+              <w:spacing w:before="80" w:after="40"/>
+              <w:jc w:val="center"/>
+            </w:pPr>
+            <w:r>
+              <w:rPr>
+                <w:b/>
+                <w:color w:val="0F172A"/>
+                <w:sz w:val="17"/>
+              </w:rPr>
+              <w:t>Figure 5: Digital ePaper &amp; Saved Edition</w:t>
+              <w:br/>
+            </w:r>
+            <w:r>
+              <w:rPr>
+                <w:color w:val="64748B"/>
+                <w:sz w:val="15"/>
+              </w:rPr>
+              <w:t>High-resolution print replica canvas with 1px column hotspot crop reading and offline download.</w:t>
+            </w:r>
+          </w:p>
+        </w:tc>
+        <w:tc>
+          <w:tcPr>
+            <w:tcW w:type="dxa" w:w="4608"/>
+            <w:shd w:fill="F8FAFC"/>
+            <w:tcMar>
+              <w:top w:w="100" w:type="dxa"/>
+              <w:bottom w:w="100" w:type="dxa"/>
+              <w:left w:w="100" w:type="dxa"/>
+              <w:right w:w="100" w:type="dxa"/>
+            </w:tcMar>
+          </w:tcPr>
+          <w:p>
+            <w:pPr>
+              <w:jc w:val="center"/>
+            </w:pPr>
+            <w:r>
+              <w:drawing>
+                <wp:inline xmlns:a="http://schemas.openxmlformats.org/drawingml/2006/main" xmlns:pic="http://schemas.openxmlformats.org/drawingml/2006/picture">
+                  <wp:extent cx="2560320" cy="4587240"/>
+                  <wp:docPr id="8" name="Picture 8"/>
+                  <wp:cNvGraphicFramePr>
+                    <a:graphicFrameLocks noChangeAspect="1"/>
+                  </wp:cNvGraphicFramePr>
+                  <a:graphic>
+                    <a:graphicData uri="http://schemas.openxmlformats.org/drawingml/2006/picture">
+                      <pic:pic>
+                        <pic:nvPicPr>
+                          <pic:cNvPr id="0" name="stitch_explore_categories.jpg"/>
+                          <pic:cNvPicPr/>
+                        </pic:nvPicPr>
+                        <pic:blipFill>
+                          <a:blip r:embed="rId16"/>
+                          <a:stretch>
+                            <a:fillRect/>
+                          </a:stretch>
+                        </pic:blipFill>
+                        <pic:spPr>
+                          <a:xfrm>
+                            <a:off x="0" y="0"/>
+                            <a:ext cx="2560320" cy="4587240"/>
+                          </a:xfrm>
+                          <a:prstGeom prst="rect"/>
+                        </pic:spPr>
+                      </pic:pic>
+                    </a:graphicData>
+                  </a:graphic>
+                </wp:inline>
+              </w:drawing>
+            </w:r>
+          </w:p>
+          <w:p>
+            <w:pPr>
+              <w:spacing w:before="80" w:after="40"/>
+              <w:jc w:val="center"/>
+            </w:pPr>
+            <w:r>
+              <w:rPr>
+                <w:b/>
+                <w:color w:val="0F172A"/>
+                <w:sz w:val="17"/>
+              </w:rPr>
+              <w:t>Figure 6: Sections Directory &amp; Topics Hub</w:t>
+              <w:br/>
+            </w:r>
+            <w:r>
+              <w:rPr>
+                <w:color w:val="64748B"/>
+                <w:sz w:val="15"/>
+              </w:rPr>
+              <w:t>Complete 14-vertical newsroom directory, district picker, AI assistant settings, and multi-language controls.</w:t>
+            </w:r>
+          </w:p>
+        </w:tc>
+      </w:tr>
+    </w:tbl>
+    <w:p>
+      <w:r>
+        <w:br w:type="page"/>
+      </w:r>
+    </w:p>
+    <w:p>
+      <w:pPr>
+        <w:pStyle w:val="Heading1"/>
+      </w:pPr>
+      <w:r>
+        <w:rPr>
+          <w:rFonts w:ascii="Calibri" w:hAnsi="Calibri"/>
+          <w:b/>
+          <w:color w:val="0F172A"/>
+          <w:sz w:val="36"/>
+        </w:rPr>
+        <w:t>5. Project Timeline &amp; Rapid Delivery Roadmap</w:t>
       </w:r>
     </w:p>
     <w:p>
@@ -1963,7 +2306,7 @@
         <w:drawing>
           <wp:inline xmlns:a="http://schemas.openxmlformats.org/drawingml/2006/main" xmlns:pic="http://schemas.openxmlformats.org/drawingml/2006/picture">
             <wp:extent cx="5669280" cy="2460506"/>
-            <wp:docPr id="5" name="Picture 5"/>
+            <wp:docPr id="9" name="Picture 9"/>
             <wp:cNvGraphicFramePr>
               <a:graphicFrameLocks noChangeAspect="1"/>
             </wp:cNvGraphicFramePr>
@@ -1975,7 +2318,7 @@
                     <pic:cNvPicPr/>
                   </pic:nvPicPr>
                   <pic:blipFill>
-                    <a:blip r:embed="rId13"/>
+                    <a:blip r:embed="rId17"/>
                     <a:stretch>
                       <a:fillRect/>
                     </a:stretch>
@@ -2005,7 +2348,7 @@
           <w:color w:val="64748B"/>
           <w:sz w:val="17"/>
         </w:rPr>
-        <w:t>Figure 3: 3-Week Express Delivery Schedule &amp; Milestones</w:t>
+        <w:t>Figure 7: 3-Week Express Delivery Schedule &amp; Milestones</w:t>
       </w:r>
     </w:p>
     <w:p>
@@ -2024,7 +2367,7 @@
           <w:color w:val="0F172A"/>
           <w:sz w:val="36"/>
         </w:rPr>
-        <w:t>5. Commercial Engagement Options</w:t>
+        <w:t>6. Commercial Engagement Options</w:t>
       </w:r>
     </w:p>
     <w:p>
@@ -2408,7 +2751,7 @@
           <w:color w:val="DC2626"/>
           <w:sz w:val="32"/>
         </w:rPr>
-        <w:t>6. সম্পাদকীয় বোর্ড ও জনাব মাহমুদুর রহমান-এর সমীপে নিবেদন</w:t>
+        <w:t>7. সম্পাদকীয় বোর্ড ও জনাব মাহমুদুর রহমান-এর সমীপে নিবেদন</w:t>
       </w:r>
     </w:p>
     <w:p>
@@ -2448,7 +2791,7 @@
           <w:color w:val="0F172A"/>
           <w:sz w:val="36"/>
         </w:rPr>
-        <w:t>7. About CybrCraft &amp; Next Steps</w:t>
+        <w:t>8. About CybrCraft &amp; Next Steps</w:t>
       </w:r>
     </w:p>
     <w:p>

</xml_diff>